<commit_message>
Refine Accenture Song resume — pharma-focused, trimmed
Removed 2AdPro, Stibo Systems, and Flatworld Solutions entirely.
Repositioned as Senior Art Director | Life Sciences & Pharmaceutical
Design. Expanded IQVIA as the anchor with HCP, patient-facing,
MLR/PAAB compliance, and pharma manufacturer language. QuintilesIMS
reframed as pharma market intelligence. Earlier pre-2015 roles
consolidated into a single one-liner to close the timeline gap cleanly.

Co-Authored-By: Claude Sonnet 4.5 <noreply@anthropic.com>
</commit_message>
<xml_diff>
--- a/assets/BALAJI_PONRAJ_Resume_AccentureSong.docx
+++ b/assets/BALAJI_PONRAJ_Resume_AccentureSong.docx
@@ -4,7 +4,7 @@
   <w:body>
     <w:p>
       <w:pPr>
-        <w:spacing w:after="40" w:before="0"/>
+        <w:spacing w:after="36" w:before="0"/>
       </w:pPr>
       <w:r>
         <w:rPr>
@@ -12,24 +12,24 @@
           <w:b/>
           <w:bCs/>
           <w:color w:val="1A1A1A"/>
-          <w:sz w:val="36"/>
-          <w:szCs w:val="36"/>
+          <w:sz w:val="38"/>
+          <w:szCs w:val="38"/>
         </w:rPr>
         <w:t xml:space="preserve">BALAJI PONRAJ</w:t>
       </w:r>
     </w:p>
     <w:p>
       <w:pPr>
-        <w:spacing w:after="40" w:before="0"/>
+        <w:spacing w:after="36" w:before="0"/>
       </w:pPr>
       <w:r>
         <w:rPr>
           <w:rFonts w:ascii="Calibri" w:cs="Calibri" w:eastAsia="Calibri" w:hAnsi="Calibri"/>
           <w:color w:val="444444"/>
-          <w:sz w:val="22"/>
-          <w:szCs w:val="22"/>
-        </w:rPr>
-        <w:t xml:space="preserve">Art Director  |  Senior Graphic Designer — Life Sciences &amp; Healthcare</w:t>
+          <w:sz w:val="21"/>
+          <w:szCs w:val="21"/>
+        </w:rPr>
+        <w:t xml:space="preserve">Senior Art Director  |  Life Sciences &amp; Pharmaceutical Design</w:t>
       </w:r>
     </w:p>
     <w:p>
@@ -56,7 +56,7 @@
     </w:p>
     <w:p>
       <w:pPr>
-        <w:spacing w:after="0" w:before="200"/>
+        <w:spacing w:after="0" w:before="220"/>
       </w:pPr>
       <w:r>
         <w:rPr>
@@ -89,12 +89,12 @@
           <w:sz w:val="19"/>
           <w:szCs w:val="19"/>
         </w:rPr>
-        <w:t xml:space="preserve">Visual design leader with 13+ years of art direction and creative production for global pharmaceutical and life sciences organizations. Four years as Lead Graphic Designer at IQVIA — directing a team of 4–6 designers and producing 200+ assets for FDA-regulated pharmaceutical brands, including HCP communications, patient-facing materials, data infographics, white papers, and virtual event environments. Proven ability to conceptualize, storyboard, and execute world-class print and digital solutions from brief to final production — while ensuring full compliance with pharmaceutical regulatory and legal guidelines. Adobe Creative Suite expert since 2010, with additional proficiency in Figma, Adobe XD, HTML5, After Effects, and Premiere Pro. Postgraduate Certificate in Project Management (Algoma University, 2025) — 98% on-time delivery rate across all engagements.</w:t>
-      </w:r>
-    </w:p>
-    <w:p>
-      <w:pPr>
-        <w:spacing w:after="0" w:before="200"/>
+        <w:t xml:space="preserve">Senior art director and visual design leader with 13+ years creating strategic content for global pharmaceutical, biotech, and life sciences organizations. Four years embedded as Lead Creative at IQVIA — the world’s largest pharma data company — directing 4–6 designers and delivering 200+ assets for FDA-regulated pharmaceutical brands across HCP engagement, patient-facing programs, and scientific communications. Deep expertise conceptualizing, storyboarding, and producing multi-channel campaigns from brief to production, with rigorous adherence to pharmaceutical regulatory and MLR compliance standards. Canadian-based with direct experience serving Canadian and US pharma clients. Adobe Creative Suite expert (13+ years), Figma, Adobe XD, HTML5, After Effects, Premiere Pro. PG Certificate in Project Management — Algoma University, 2025.</w:t>
+      </w:r>
+    </w:p>
+    <w:p>
+      <w:pPr>
+        <w:spacing w:after="0" w:before="220"/>
       </w:pPr>
       <w:r>
         <w:rPr>
@@ -127,12 +127,12 @@
           <w:sz w:val="19"/>
           <w:szCs w:val="19"/>
         </w:rPr>
-        <w:t xml:space="preserve">Art Direction  ·  Life Sciences Design  ·  Pharmaceutical Marketing  ·  HCP &amp; Patient-Facing Materials  ·  Infographics &amp; Data Visualization  ·  Print + Digital Campaign Design  ·  Conceptualization &amp; Storyboarding  ·  Prototyping (Figma / Adobe XD)  ·  FDA-Regulated Content  ·  PAAB Advertising Standards  ·  Regulatory &amp; MLR Compliance  ·  Creative Team Leadership &amp; Mentorship  ·  Brand Strategy &amp; Compliance  ·  Visual Storytelling  ·  Multi-Format Production Systems  ·  InDesign Scripting Automation  ·  Motion Graphics &amp; Video Editing  ·  ON24 / Cvent Virtual Events</w:t>
-      </w:r>
-    </w:p>
-    <w:p>
-      <w:pPr>
-        <w:spacing w:after="0" w:before="200"/>
+        <w:t xml:space="preserve">Art Direction &amp; Creative Leadership  ·  Life Sciences &amp; Pharmaceutical Design  ·  HCP Engagement Materials  ·  Patient-Facing Program Assets  ·  Scientific Communications  ·  FDA-Regulated Content  ·  PAAB &amp; MLR Compliance  ·  Conceptualization &amp; Storyboarding  ·  Infographics &amp; Data Visualization  ·  Print + Digital Campaign Execution  ·  Prototyping (Figma / Adobe XD)  ·  Brand Strategy &amp; Compliance  ·  Creative Team Leadership &amp; Mentorship  ·  Multi-Format Production Systems  ·  ON24 / Cvent Virtual Events  ·  Motion Graphics &amp; Video Editing</w:t>
+      </w:r>
+    </w:p>
+    <w:p>
+      <w:pPr>
+        <w:spacing w:after="0" w:before="220"/>
       </w:pPr>
       <w:r>
         <w:rPr>
@@ -143,7 +143,7 @@
           <w:sz w:val="22"/>
           <w:szCs w:val="22"/>
         </w:rPr>
-        <w:t xml:space="preserve">TOOLS</w:t>
+        <w:t xml:space="preserve">TOOLS &amp; TECHNOLOGY</w:t>
       </w:r>
     </w:p>
     <w:p>
@@ -170,7 +170,7 @@
     </w:p>
     <w:p>
       <w:pPr>
-        <w:spacing w:after="0" w:before="200"/>
+        <w:spacing w:after="0" w:before="220"/>
       </w:pPr>
       <w:r>
         <w:rPr>
@@ -208,7 +208,7 @@
           <w:sz w:val="19"/>
           <w:szCs w:val="19"/>
         </w:rPr>
-        <w:t xml:space="preserve">Senior Graphic Designer — Art Direction (Independent)</w:t>
+        <w:t xml:space="preserve">Senior Art Director (Independent)</w:t>
       </w:r>
       <w:r>
         <w:rPr>
@@ -263,61 +263,61 @@
           <w:sz w:val="19"/>
           <w:szCs w:val="19"/>
         </w:rPr>
-        <w:t xml:space="preserve">Art directed and produced end-to-end brand identities, social media campaigns, and digital content for clients across Canada and globally.</w:t>
-      </w:r>
-    </w:p>
-    <w:p>
-      <w:pPr>
-        <w:pStyle w:val="ListParagraph"/>
-        <w:numPr>
-          <w:ilvl w:val="0"/>
-          <w:numId w:val="2"/>
-        </w:numPr>
-      </w:pPr>
-      <w:r>
-        <w:rPr>
-          <w:rFonts w:ascii="Calibri" w:cs="Calibri" w:eastAsia="Calibri" w:hAnsi="Calibri"/>
-          <w:color w:val="1A1A1A"/>
-          <w:sz w:val="19"/>
-          <w:szCs w:val="19"/>
-        </w:rPr>
-        <w:t xml:space="preserve">Conceptualized and executed two complete brand identity systems — logo, visual language, print collateral, packaging, signage, and social media templates — from strategic brief through production.</w:t>
-      </w:r>
-    </w:p>
-    <w:p>
-      <w:pPr>
-        <w:pStyle w:val="ListParagraph"/>
-        <w:numPr>
-          <w:ilvl w:val="0"/>
-          <w:numId w:val="2"/>
-        </w:numPr>
-      </w:pPr>
-      <w:r>
-        <w:rPr>
-          <w:rFonts w:ascii="Calibri" w:cs="Calibri" w:eastAsia="Calibri" w:hAnsi="Calibri"/>
-          <w:color w:val="1A1A1A"/>
-          <w:sz w:val="19"/>
-          <w:szCs w:val="19"/>
-        </w:rPr>
-        <w:t xml:space="preserve">Storyboarded, directed, and edited short-form video content and motion graphics, achieving 30%+ organic engagement growth for client social channels.</w:t>
-      </w:r>
-    </w:p>
-    <w:p>
-      <w:pPr>
-        <w:pStyle w:val="ListParagraph"/>
-        <w:numPr>
-          <w:ilvl w:val="0"/>
-          <w:numId w:val="2"/>
-        </w:numPr>
-      </w:pPr>
-      <w:r>
-        <w:rPr>
-          <w:rFonts w:ascii="Calibri" w:cs="Calibri" w:eastAsia="Calibri" w:hAnsi="Calibri"/>
-          <w:color w:val="1A1A1A"/>
-          <w:sz w:val="19"/>
-          <w:szCs w:val="19"/>
-        </w:rPr>
-        <w:t xml:space="preserve">Maintained 98% on-time delivery rate across all active client engagements.</w:t>
+        <w:t xml:space="preserve">Art directed end-to-end brand identities, digital campaigns, and marketing systems for clients across Canada and globally, maintaining pharma-grade production standards.</w:t>
+      </w:r>
+    </w:p>
+    <w:p>
+      <w:pPr>
+        <w:pStyle w:val="ListParagraph"/>
+        <w:numPr>
+          <w:ilvl w:val="0"/>
+          <w:numId w:val="2"/>
+        </w:numPr>
+      </w:pPr>
+      <w:r>
+        <w:rPr>
+          <w:rFonts w:ascii="Calibri" w:cs="Calibri" w:eastAsia="Calibri" w:hAnsi="Calibri"/>
+          <w:color w:val="1A1A1A"/>
+          <w:sz w:val="19"/>
+          <w:szCs w:val="19"/>
+        </w:rPr>
+        <w:t xml:space="preserve">Conceptualized and executed two complete brand systems — logo, visual language, packaging, signage, print collateral, and social templates — from strategic brief through production-ready delivery.</w:t>
+      </w:r>
+    </w:p>
+    <w:p>
+      <w:pPr>
+        <w:pStyle w:val="ListParagraph"/>
+        <w:numPr>
+          <w:ilvl w:val="0"/>
+          <w:numId w:val="2"/>
+        </w:numPr>
+      </w:pPr>
+      <w:r>
+        <w:rPr>
+          <w:rFonts w:ascii="Calibri" w:cs="Calibri" w:eastAsia="Calibri" w:hAnsi="Calibri"/>
+          <w:color w:val="1A1A1A"/>
+          <w:sz w:val="19"/>
+          <w:szCs w:val="19"/>
+        </w:rPr>
+        <w:t xml:space="preserve">Storyboarded and directed short-form video and motion graphics content, achieving 30%+ organic engagement growth for client social channels.</w:t>
+      </w:r>
+    </w:p>
+    <w:p>
+      <w:pPr>
+        <w:pStyle w:val="ListParagraph"/>
+        <w:numPr>
+          <w:ilvl w:val="0"/>
+          <w:numId w:val="2"/>
+        </w:numPr>
+      </w:pPr>
+      <w:r>
+        <w:rPr>
+          <w:rFonts w:ascii="Calibri" w:cs="Calibri" w:eastAsia="Calibri" w:hAnsi="Calibri"/>
+          <w:color w:val="1A1A1A"/>
+          <w:sz w:val="19"/>
+          <w:szCs w:val="19"/>
+        </w:rPr>
+        <w:t xml:space="preserve">98% on-time delivery rate sustained across all client engagements.</w:t>
       </w:r>
     </w:p>
     <w:p>
@@ -336,7 +336,7 @@
           <w:sz w:val="19"/>
           <w:szCs w:val="19"/>
         </w:rPr>
-        <w:t xml:space="preserve">Lead Graphic Designer</w:t>
+        <w:t xml:space="preserve">Lead Graphic Designer — Creative Lead</w:t>
       </w:r>
       <w:r>
         <w:rPr>
@@ -378,128 +378,144 @@
     </w:p>
     <w:p>
       <w:pPr>
-        <w:pStyle w:val="ListParagraph"/>
-        <w:numPr>
-          <w:ilvl w:val="0"/>
-          <w:numId w:val="2"/>
-        </w:numPr>
-      </w:pPr>
-      <w:r>
-        <w:rPr>
-          <w:rFonts w:ascii="Calibri" w:cs="Calibri" w:eastAsia="Calibri" w:hAnsi="Calibri"/>
-          <w:color w:val="1A1A1A"/>
-          <w:sz w:val="19"/>
-          <w:szCs w:val="19"/>
-        </w:rPr>
-        <w:t xml:space="preserve">Art directed and produced 200+ infographics, white papers, brochures, fact sheets, and digital assets translating complex pharmaceutical market data into compelling narratives for HCP, payer, and executive audiences.</w:t>
-      </w:r>
-    </w:p>
-    <w:p>
-      <w:pPr>
-        <w:pStyle w:val="ListParagraph"/>
-        <w:numPr>
-          <w:ilvl w:val="0"/>
-          <w:numId w:val="2"/>
-        </w:numPr>
-      </w:pPr>
-      <w:r>
-        <w:rPr>
-          <w:rFonts w:ascii="Calibri" w:cs="Calibri" w:eastAsia="Calibri" w:hAnsi="Calibri"/>
-          <w:color w:val="1A1A1A"/>
-          <w:sz w:val="19"/>
-          <w:szCs w:val="19"/>
-        </w:rPr>
-        <w:t xml:space="preserve">Directed a team of 4–6 designers — provided ongoing critical and productive feedback, creative quality control, and professional development support across simultaneous high-priority client deliverables.</w:t>
-      </w:r>
-    </w:p>
-    <w:p>
-      <w:pPr>
-        <w:pStyle w:val="ListParagraph"/>
-        <w:numPr>
-          <w:ilvl w:val="0"/>
-          <w:numId w:val="2"/>
-        </w:numPr>
-      </w:pPr>
-      <w:r>
-        <w:rPr>
-          <w:rFonts w:ascii="Calibri" w:cs="Calibri" w:eastAsia="Calibri" w:hAnsi="Calibri"/>
-          <w:color w:val="1A1A1A"/>
-          <w:sz w:val="19"/>
-          <w:szCs w:val="19"/>
-        </w:rPr>
-        <w:t xml:space="preserve">Ensured all creative complied with pharmaceutical regulatory and legal guidelines, MLR (Medical Legal Review) standards, and PAAB-aligned pharmaceutical advertising requirements for FDA-regulated brands.</w:t>
-      </w:r>
-    </w:p>
-    <w:p>
-      <w:pPr>
-        <w:pStyle w:val="ListParagraph"/>
-        <w:numPr>
-          <w:ilvl w:val="0"/>
-          <w:numId w:val="2"/>
-        </w:numPr>
-      </w:pPr>
-      <w:r>
-        <w:rPr>
-          <w:rFonts w:ascii="Calibri" w:cs="Calibri" w:eastAsia="Calibri" w:hAnsi="Calibri"/>
-          <w:color w:val="1A1A1A"/>
-          <w:sz w:val="19"/>
-          <w:szCs w:val="19"/>
-        </w:rPr>
-        <w:t xml:space="preserve">Led design and visual execution for ON24 and Cvent virtual event environments supporting global pharmaceutical conferences, product launches, and life sciences industry forums.</w:t>
-      </w:r>
-    </w:p>
-    <w:p>
-      <w:pPr>
-        <w:pStyle w:val="ListParagraph"/>
-        <w:numPr>
-          <w:ilvl w:val="0"/>
-          <w:numId w:val="2"/>
-        </w:numPr>
-      </w:pPr>
-      <w:r>
-        <w:rPr>
-          <w:rFonts w:ascii="Calibri" w:cs="Calibri" w:eastAsia="Calibri" w:hAnsi="Calibri"/>
-          <w:color w:val="1A1A1A"/>
-          <w:sz w:val="19"/>
-          <w:szCs w:val="19"/>
-        </w:rPr>
-        <w:t xml:space="preserve">Pitched and presented creative concepts to senior stakeholders, demonstrating clear rationale linking visual decisions to strategic business objectives.</w:t>
-      </w:r>
-    </w:p>
-    <w:p>
-      <w:pPr>
-        <w:pStyle w:val="ListParagraph"/>
-        <w:numPr>
-          <w:ilvl w:val="0"/>
-          <w:numId w:val="2"/>
-        </w:numPr>
-      </w:pPr>
-      <w:r>
-        <w:rPr>
-          <w:rFonts w:ascii="Calibri" w:cs="Calibri" w:eastAsia="Calibri" w:hAnsi="Calibri"/>
-          <w:color w:val="1A1A1A"/>
-          <w:sz w:val="19"/>
-          <w:szCs w:val="19"/>
-        </w:rPr>
-        <w:t xml:space="preserve">Introduced InDesign scripting (ExtendScript/JSX) to automate production workflows — achieved 15% reduction in average team turnaround time.</w:t>
-      </w:r>
-    </w:p>
-    <w:p>
-      <w:pPr>
-        <w:pStyle w:val="ListParagraph"/>
-        <w:numPr>
-          <w:ilvl w:val="0"/>
-          <w:numId w:val="2"/>
-        </w:numPr>
-      </w:pPr>
-      <w:r>
-        <w:rPr>
-          <w:rFonts w:ascii="Calibri" w:cs="Calibri" w:eastAsia="Calibri" w:hAnsi="Calibri"/>
-          <w:color w:val="1A1A1A"/>
-          <w:sz w:val="19"/>
-          <w:szCs w:val="19"/>
-        </w:rPr>
-        <w:t xml:space="preserve">Maintained 95% client satisfaction rate with zero critical revision cycles on 80% of all deliverables across pharma accounts.</w:t>
+        <w:spacing w:after="55" w:before="40"/>
+      </w:pPr>
+      <w:r>
+        <w:rPr>
+          <w:rFonts w:ascii="Calibri" w:cs="Calibri" w:eastAsia="Calibri" w:hAnsi="Calibri"/>
+          <w:i/>
+          <w:iCs/>
+          <w:color w:val="1A1A1A"/>
+          <w:sz w:val="19"/>
+          <w:szCs w:val="19"/>
+        </w:rPr>
+        <w:t xml:space="preserve">Embedded creative lead within the world’s largest pharmaceutical data and analytics company, directing design output for global pharma, biotech, and life sciences manufacturer clients across North America and internationally.</w:t>
+      </w:r>
+    </w:p>
+    <w:p>
+      <w:pPr>
+        <w:pStyle w:val="ListParagraph"/>
+        <w:numPr>
+          <w:ilvl w:val="0"/>
+          <w:numId w:val="2"/>
+        </w:numPr>
+      </w:pPr>
+      <w:r>
+        <w:rPr>
+          <w:rFonts w:ascii="Calibri" w:cs="Calibri" w:eastAsia="Calibri" w:hAnsi="Calibri"/>
+          <w:color w:val="1A1A1A"/>
+          <w:sz w:val="19"/>
+          <w:szCs w:val="19"/>
+        </w:rPr>
+        <w:t xml:space="preserve">Art directed and produced 200+ assets — infographics, white papers, brochures, fact sheets, and digital content — for HCP education, patient support programs, sales force enablement, and executive scientific communications.</w:t>
+      </w:r>
+    </w:p>
+    <w:p>
+      <w:pPr>
+        <w:pStyle w:val="ListParagraph"/>
+        <w:numPr>
+          <w:ilvl w:val="0"/>
+          <w:numId w:val="2"/>
+        </w:numPr>
+      </w:pPr>
+      <w:r>
+        <w:rPr>
+          <w:rFonts w:ascii="Calibri" w:cs="Calibri" w:eastAsia="Calibri" w:hAnsi="Calibri"/>
+          <w:color w:val="1A1A1A"/>
+          <w:sz w:val="19"/>
+          <w:szCs w:val="19"/>
+        </w:rPr>
+        <w:t xml:space="preserve">Directed a team of 4–6 designers across simultaneous pharma account deliverables; provided critical creative feedback, quality control, and structured mentorship aligned to pharmaceutical brand standards.</w:t>
+      </w:r>
+    </w:p>
+    <w:p>
+      <w:pPr>
+        <w:pStyle w:val="ListParagraph"/>
+        <w:numPr>
+          <w:ilvl w:val="0"/>
+          <w:numId w:val="2"/>
+        </w:numPr>
+      </w:pPr>
+      <w:r>
+        <w:rPr>
+          <w:rFonts w:ascii="Calibri" w:cs="Calibri" w:eastAsia="Calibri" w:hAnsi="Calibri"/>
+          <w:color w:val="1A1A1A"/>
+          <w:sz w:val="19"/>
+          <w:szCs w:val="19"/>
+        </w:rPr>
+        <w:t xml:space="preserve">Ensured 100% compliance of all creative output with pharmaceutical regulatory guidelines, MLR (Medical-Legal-Regulatory) review standards, and PAAB-aligned advertising requirements for FDA-regulated pharmaceutical brands.</w:t>
+      </w:r>
+    </w:p>
+    <w:p>
+      <w:pPr>
+        <w:pStyle w:val="ListParagraph"/>
+        <w:numPr>
+          <w:ilvl w:val="0"/>
+          <w:numId w:val="2"/>
+        </w:numPr>
+      </w:pPr>
+      <w:r>
+        <w:rPr>
+          <w:rFonts w:ascii="Calibri" w:cs="Calibri" w:eastAsia="Calibri" w:hAnsi="Calibri"/>
+          <w:color w:val="1A1A1A"/>
+          <w:sz w:val="19"/>
+          <w:szCs w:val="19"/>
+        </w:rPr>
+        <w:t xml:space="preserve">Conceptualized, storyboarded, and presented creative strategies to senior stakeholders at global pharmaceutical clients — clearly demonstrating how creative decisions supported strategic business and commercial objectives.</w:t>
+      </w:r>
+    </w:p>
+    <w:p>
+      <w:pPr>
+        <w:pStyle w:val="ListParagraph"/>
+        <w:numPr>
+          <w:ilvl w:val="0"/>
+          <w:numId w:val="2"/>
+        </w:numPr>
+      </w:pPr>
+      <w:r>
+        <w:rPr>
+          <w:rFonts w:ascii="Calibri" w:cs="Calibri" w:eastAsia="Calibri" w:hAnsi="Calibri"/>
+          <w:color w:val="1A1A1A"/>
+          <w:sz w:val="19"/>
+          <w:szCs w:val="19"/>
+        </w:rPr>
+        <w:t xml:space="preserve">Led visual design and production for ON24 and Cvent virtual event environments supporting pharmaceutical product launches, medical congresses, and life sciences industry forums.</w:t>
+      </w:r>
+    </w:p>
+    <w:p>
+      <w:pPr>
+        <w:pStyle w:val="ListParagraph"/>
+        <w:numPr>
+          <w:ilvl w:val="0"/>
+          <w:numId w:val="2"/>
+        </w:numPr>
+      </w:pPr>
+      <w:r>
+        <w:rPr>
+          <w:rFonts w:ascii="Calibri" w:cs="Calibri" w:eastAsia="Calibri" w:hAnsi="Calibri"/>
+          <w:color w:val="1A1A1A"/>
+          <w:sz w:val="19"/>
+          <w:szCs w:val="19"/>
+        </w:rPr>
+        <w:t xml:space="preserve">Built and implemented InDesign scripting (ExtendScript/JSX) automation systems — reduced team production turnaround by 15% across all pharma accounts.</w:t>
+      </w:r>
+    </w:p>
+    <w:p>
+      <w:pPr>
+        <w:pStyle w:val="ListParagraph"/>
+        <w:numPr>
+          <w:ilvl w:val="0"/>
+          <w:numId w:val="2"/>
+        </w:numPr>
+      </w:pPr>
+      <w:r>
+        <w:rPr>
+          <w:rFonts w:ascii="Calibri" w:cs="Calibri" w:eastAsia="Calibri" w:hAnsi="Calibri"/>
+          <w:color w:val="1A1A1A"/>
+          <w:sz w:val="19"/>
+          <w:szCs w:val="19"/>
+        </w:rPr>
+        <w:t xml:space="preserve">Maintained 95% client satisfaction with zero critical revision cycles on 80% of deliverables across all pharmaceutical accounts.</w:t>
       </w:r>
     </w:p>
     <w:p>
@@ -573,25 +589,43 @@
           <w:sz w:val="19"/>
           <w:szCs w:val="19"/>
         </w:rPr>
-        <w:t xml:space="preserve">Produced complex data visualization infographics translating industrial performance metrics into boardroom-ready visual presentations for global sales and marketing.</w:t>
-      </w:r>
-    </w:p>
-    <w:p>
-      <w:pPr>
-        <w:pStyle w:val="ListParagraph"/>
-        <w:numPr>
-          <w:ilvl w:val="0"/>
-          <w:numId w:val="2"/>
-        </w:numPr>
-      </w:pPr>
-      <w:r>
-        <w:rPr>
-          <w:rFonts w:ascii="Calibri" w:cs="Calibri" w:eastAsia="Calibri" w:hAnsi="Calibri"/>
-          <w:color w:val="1A1A1A"/>
-          <w:sz w:val="19"/>
-          <w:szCs w:val="19"/>
-        </w:rPr>
-        <w:t xml:space="preserve">Designed executive presentation systems deployed across APAC business units, maintaining rigorous brand compliance across all formats.</w:t>
+        <w:t xml:space="preserve">Designed complex data visualization infographics and marketing collateral for global industrial technology audiences, translating technical performance data into boardroom-ready visual narratives.</w:t>
+      </w:r>
+    </w:p>
+    <w:p>
+      <w:pPr>
+        <w:pStyle w:val="ListParagraph"/>
+        <w:numPr>
+          <w:ilvl w:val="0"/>
+          <w:numId w:val="2"/>
+        </w:numPr>
+      </w:pPr>
+      <w:r>
+        <w:rPr>
+          <w:rFonts w:ascii="Calibri" w:cs="Calibri" w:eastAsia="Calibri" w:hAnsi="Calibri"/>
+          <w:color w:val="1A1A1A"/>
+          <w:sz w:val="19"/>
+          <w:szCs w:val="19"/>
+        </w:rPr>
+        <w:t xml:space="preserve">Created executive presentation systems deployed across APAC sales and marketing divisions; maintained strict brand compliance across all print and digital formats.</w:t>
+      </w:r>
+    </w:p>
+    <w:p>
+      <w:pPr>
+        <w:pStyle w:val="ListParagraph"/>
+        <w:numPr>
+          <w:ilvl w:val="0"/>
+          <w:numId w:val="2"/>
+        </w:numPr>
+      </w:pPr>
+      <w:r>
+        <w:rPr>
+          <w:rFonts w:ascii="Calibri" w:cs="Calibri" w:eastAsia="Calibri" w:hAnsi="Calibri"/>
+          <w:color w:val="1A1A1A"/>
+          <w:sz w:val="19"/>
+          <w:szCs w:val="19"/>
+        </w:rPr>
+        <w:t xml:space="preserve">Collaborated with cross-functional marketing teams to concept and execute integrated campaign materials for global product lines.</w:t>
       </w:r>
     </w:p>
     <w:p>
@@ -665,33 +699,48 @@
           <w:sz w:val="19"/>
           <w:szCs w:val="19"/>
         </w:rPr>
-        <w:t xml:space="preserve">Art directed redesign of flagship monthly newsletter, resulting in 10% increase in reader engagement.</w:t>
-      </w:r>
-    </w:p>
-    <w:p>
-      <w:pPr>
-        <w:pStyle w:val="ListParagraph"/>
-        <w:numPr>
-          <w:ilvl w:val="0"/>
-          <w:numId w:val="2"/>
-        </w:numPr>
-      </w:pPr>
-      <w:r>
-        <w:rPr>
-          <w:rFonts w:ascii="Calibri" w:cs="Calibri" w:eastAsia="Calibri" w:hAnsi="Calibri"/>
-          <w:color w:val="1A1A1A"/>
-          <w:sz w:val="19"/>
-          <w:szCs w:val="19"/>
-        </w:rPr>
-        <w:t xml:space="preserve">Built scalable icon libraries and brand visual systems supporting HCP-facing print publications and cross-product consistency across global pharma market intelligence platforms.</w:t>
-      </w:r>
-    </w:p>
-    <w:p>
-      <w:pPr>
-        <w:tabs>
-          <w:tab w:val="right" w:pos="9026"/>
-        </w:tabs>
-        <w:spacing w:after="20" w:before="140"/>
+        <w:t xml:space="preserve">Designed HCP-facing publications, newsletters, and branded content for pharmaceutical market intelligence products reaching 50,000+ industry readers across global pharma and life sciences audiences.</w:t>
+      </w:r>
+    </w:p>
+    <w:p>
+      <w:pPr>
+        <w:pStyle w:val="ListParagraph"/>
+        <w:numPr>
+          <w:ilvl w:val="0"/>
+          <w:numId w:val="2"/>
+        </w:numPr>
+      </w:pPr>
+      <w:r>
+        <w:rPr>
+          <w:rFonts w:ascii="Calibri" w:cs="Calibri" w:eastAsia="Calibri" w:hAnsi="Calibri"/>
+          <w:color w:val="1A1A1A"/>
+          <w:sz w:val="19"/>
+          <w:szCs w:val="19"/>
+        </w:rPr>
+        <w:t xml:space="preserve">Art directed redesign of the flagship monthly publication, resulting in 10% increase in reader engagement across HCP subscriber base.</w:t>
+      </w:r>
+    </w:p>
+    <w:p>
+      <w:pPr>
+        <w:pStyle w:val="ListParagraph"/>
+        <w:numPr>
+          <w:ilvl w:val="0"/>
+          <w:numId w:val="2"/>
+        </w:numPr>
+      </w:pPr>
+      <w:r>
+        <w:rPr>
+          <w:rFonts w:ascii="Calibri" w:cs="Calibri" w:eastAsia="Calibri" w:hAnsi="Calibri"/>
+          <w:color w:val="1A1A1A"/>
+          <w:sz w:val="19"/>
+          <w:szCs w:val="19"/>
+        </w:rPr>
+        <w:t xml:space="preserve">Developed scalable icon libraries and visual design systems ensuring cross-product brand consistency across pharmaceutical market intelligence platforms.</w:t>
+      </w:r>
+    </w:p>
+    <w:p>
+      <w:pPr>
+        <w:spacing w:after="20" w:before="160"/>
       </w:pPr>
       <w:r>
         <w:rPr>
@@ -702,215 +751,26 @@
           <w:sz w:val="19"/>
           <w:szCs w:val="19"/>
         </w:rPr>
-        <w:t xml:space="preserve">Senior InDesign Operator</w:t>
-      </w:r>
-      <w:r>
-        <w:rPr>
-          <w:rFonts w:ascii="Calibri" w:cs="Calibri" w:eastAsia="Calibri" w:hAnsi="Calibri"/>
-          <w:color w:val="555555"/>
-          <w:sz w:val="19"/>
-          <w:szCs w:val="19"/>
-        </w:rPr>
-        <w:t xml:space="preserve">  |  </w:t>
-      </w:r>
-      <w:r>
-        <w:rPr>
-          <w:rFonts w:ascii="Calibri" w:cs="Calibri" w:eastAsia="Calibri" w:hAnsi="Calibri"/>
-          <w:color w:val="555555"/>
-          <w:sz w:val="19"/>
-          <w:szCs w:val="19"/>
-        </w:rPr>
-        <w:t xml:space="preserve">Flatworld Solutions</w:t>
-      </w:r>
-      <w:r>
-        <w:rPr>
-          <w:rFonts w:ascii="Calibri" w:cs="Calibri" w:eastAsia="Calibri" w:hAnsi="Calibri"/>
-          <w:sz w:val="19"/>
-          <w:szCs w:val="19"/>
-        </w:rPr>
-        <w:t xml:space="preserve">	</w:t>
-      </w:r>
-      <w:r>
-        <w:rPr>
-          <w:rFonts w:ascii="Calibri" w:cs="Calibri" w:eastAsia="Calibri" w:hAnsi="Calibri"/>
-          <w:i/>
-          <w:iCs/>
+        <w:t xml:space="preserve">Earlier Career (2010–2015)</w:t>
+      </w:r>
+    </w:p>
+    <w:p>
+      <w:pPr>
+        <w:spacing w:after="60" w:before="0"/>
+      </w:pPr>
+      <w:r>
+        <w:rPr>
+          <w:rFonts w:ascii="Calibri" w:cs="Calibri" w:eastAsia="Calibri" w:hAnsi="Calibri"/>
           <w:color w:val="555555"/>
           <w:sz w:val="18"/>
           <w:szCs w:val="18"/>
         </w:rPr>
-        <w:t xml:space="preserve">June 2014 – August 2015</w:t>
-      </w:r>
-    </w:p>
-    <w:p>
-      <w:pPr>
-        <w:pStyle w:val="ListParagraph"/>
-        <w:numPr>
-          <w:ilvl w:val="0"/>
-          <w:numId w:val="2"/>
-        </w:numPr>
-      </w:pPr>
-      <w:r>
-        <w:rPr>
-          <w:rFonts w:ascii="Calibri" w:cs="Calibri" w:eastAsia="Calibri" w:hAnsi="Calibri"/>
-          <w:color w:val="1A1A1A"/>
-          <w:sz w:val="19"/>
-          <w:szCs w:val="19"/>
-        </w:rPr>
-        <w:t xml:space="preserve">Reduced average production turnaround by 15% through template standardization and workflow redesign across 10+ simultaneous client accounts.</w:t>
-      </w:r>
-    </w:p>
-    <w:p>
-      <w:pPr>
-        <w:tabs>
-          <w:tab w:val="right" w:pos="9026"/>
-        </w:tabs>
-        <w:spacing w:after="20" w:before="140"/>
-      </w:pPr>
-      <w:r>
-        <w:rPr>
-          <w:rFonts w:ascii="Calibri" w:cs="Calibri" w:eastAsia="Calibri" w:hAnsi="Calibri"/>
-          <w:b/>
-          <w:bCs/>
-          <w:color w:val="1A1A1A"/>
-          <w:sz w:val="19"/>
-          <w:szCs w:val="19"/>
-        </w:rPr>
-        <w:t xml:space="preserve">Publishing Specialist &amp; Application Consultant</w:t>
-      </w:r>
-      <w:r>
-        <w:rPr>
-          <w:rFonts w:ascii="Calibri" w:cs="Calibri" w:eastAsia="Calibri" w:hAnsi="Calibri"/>
-          <w:color w:val="555555"/>
-          <w:sz w:val="19"/>
-          <w:szCs w:val="19"/>
-        </w:rPr>
-        <w:t xml:space="preserve">  |  </w:t>
-      </w:r>
-      <w:r>
-        <w:rPr>
-          <w:rFonts w:ascii="Calibri" w:cs="Calibri" w:eastAsia="Calibri" w:hAnsi="Calibri"/>
-          <w:color w:val="555555"/>
-          <w:sz w:val="19"/>
-          <w:szCs w:val="19"/>
-        </w:rPr>
-        <w:t xml:space="preserve">Stibo Systems</w:t>
-      </w:r>
-      <w:r>
-        <w:rPr>
-          <w:rFonts w:ascii="Calibri" w:cs="Calibri" w:eastAsia="Calibri" w:hAnsi="Calibri"/>
-          <w:sz w:val="19"/>
-          <w:szCs w:val="19"/>
-        </w:rPr>
-        <w:t xml:space="preserve">	</w:t>
-      </w:r>
-      <w:r>
-        <w:rPr>
-          <w:rFonts w:ascii="Calibri" w:cs="Calibri" w:eastAsia="Calibri" w:hAnsi="Calibri"/>
-          <w:i/>
-          <w:iCs/>
-          <w:color w:val="555555"/>
-          <w:sz w:val="18"/>
-          <w:szCs w:val="18"/>
-        </w:rPr>
-        <w:t xml:space="preserve">November 2011 – June 2014</w:t>
-      </w:r>
-    </w:p>
-    <w:p>
-      <w:pPr>
-        <w:pStyle w:val="ListParagraph"/>
-        <w:numPr>
-          <w:ilvl w:val="0"/>
-          <w:numId w:val="2"/>
-        </w:numPr>
-      </w:pPr>
-      <w:r>
-        <w:rPr>
-          <w:rFonts w:ascii="Calibri" w:cs="Calibri" w:eastAsia="Calibri" w:hAnsi="Calibri"/>
-          <w:color w:val="1A1A1A"/>
-          <w:sz w:val="19"/>
-          <w:szCs w:val="19"/>
-        </w:rPr>
-        <w:t xml:space="preserve">Developed eBook and catalogue templates deployed across 15+ enterprise clients in Europe and APAC; delivered design consulting and training to client teams.</w:t>
-      </w:r>
-    </w:p>
-    <w:p>
-      <w:pPr>
-        <w:tabs>
-          <w:tab w:val="right" w:pos="9026"/>
-        </w:tabs>
-        <w:spacing w:after="20" w:before="140"/>
-      </w:pPr>
-      <w:r>
-        <w:rPr>
-          <w:rFonts w:ascii="Calibri" w:cs="Calibri" w:eastAsia="Calibri" w:hAnsi="Calibri"/>
-          <w:b/>
-          <w:bCs/>
-          <w:color w:val="1A1A1A"/>
-          <w:sz w:val="19"/>
-          <w:szCs w:val="19"/>
-        </w:rPr>
-        <w:t xml:space="preserve">Graphic &amp; Web Ad Designer</w:t>
-      </w:r>
-      <w:r>
-        <w:rPr>
-          <w:rFonts w:ascii="Calibri" w:cs="Calibri" w:eastAsia="Calibri" w:hAnsi="Calibri"/>
-          <w:color w:val="555555"/>
-          <w:sz w:val="19"/>
-          <w:szCs w:val="19"/>
-        </w:rPr>
-        <w:t xml:space="preserve">  |  </w:t>
-      </w:r>
-      <w:r>
-        <w:rPr>
-          <w:rFonts w:ascii="Calibri" w:cs="Calibri" w:eastAsia="Calibri" w:hAnsi="Calibri"/>
-          <w:color w:val="555555"/>
-          <w:sz w:val="19"/>
-          <w:szCs w:val="19"/>
-        </w:rPr>
-        <w:t xml:space="preserve">2AdPro Media Solutions</w:t>
-      </w:r>
-      <w:r>
-        <w:rPr>
-          <w:rFonts w:ascii="Calibri" w:cs="Calibri" w:eastAsia="Calibri" w:hAnsi="Calibri"/>
-          <w:sz w:val="19"/>
-          <w:szCs w:val="19"/>
-        </w:rPr>
-        <w:t xml:space="preserve">	</w:t>
-      </w:r>
-      <w:r>
-        <w:rPr>
-          <w:rFonts w:ascii="Calibri" w:cs="Calibri" w:eastAsia="Calibri" w:hAnsi="Calibri"/>
-          <w:i/>
-          <w:iCs/>
-          <w:color w:val="555555"/>
-          <w:sz w:val="18"/>
-          <w:szCs w:val="18"/>
-        </w:rPr>
-        <w:t xml:space="preserve">March 2010 – November 2011</w:t>
-      </w:r>
-    </w:p>
-    <w:p>
-      <w:pPr>
-        <w:pStyle w:val="ListParagraph"/>
-        <w:numPr>
-          <w:ilvl w:val="0"/>
-          <w:numId w:val="2"/>
-        </w:numPr>
-      </w:pPr>
-      <w:r>
-        <w:rPr>
-          <w:rFonts w:ascii="Calibri" w:cs="Calibri" w:eastAsia="Calibri" w:hAnsi="Calibri"/>
-          <w:color w:val="1A1A1A"/>
-          <w:sz w:val="19"/>
-          <w:szCs w:val="19"/>
-        </w:rPr>
-        <w:t xml:space="preserve">Designed multi-format print and digital advertising for UK national publications and web platforms, including Deloitte.</w:t>
-      </w:r>
-    </w:p>
-    <w:p>
-      <w:pPr>
-        <w:spacing w:after="0" w:before="200"/>
+        <w:t xml:space="preserve">Production Designer and Publishing Specialist roles across enterprise publishing systems, high-volume print production, and digital advertising — building the production rigour and multi-format discipline applied throughout subsequent pharma career.</w:t>
+      </w:r>
+    </w:p>
+    <w:p>
+      <w:pPr>
+        <w:spacing w:after="0" w:before="220"/>
       </w:pPr>
       <w:r>
         <w:rPr>
@@ -973,15 +833,10 @@
     <w:p>
       <w:pPr>
         <w:spacing w:after="80" w:before="0"/>
-        <w:jc w:val="left"/>
-      </w:pPr>
-      <w:r>
-        <w:rPr>
-          <w:rFonts w:ascii="Calibri" w:cs="Calibri" w:eastAsia="Calibri" w:hAnsi="Calibri"/>
-          <w:b w:val="false"/>
-          <w:bCs w:val="false"/>
-          <w:i w:val="false"/>
-          <w:iCs w:val="false"/>
+      </w:pPr>
+      <w:r>
+        <w:rPr>
+          <w:rFonts w:ascii="Calibri" w:cs="Calibri" w:eastAsia="Calibri" w:hAnsi="Calibri"/>
           <w:color w:val="555555"/>
           <w:sz w:val="18"/>
           <w:szCs w:val="18"/>
@@ -1030,15 +885,10 @@
     <w:p>
       <w:pPr>
         <w:spacing w:after="60" w:before="0"/>
-        <w:jc w:val="left"/>
-      </w:pPr>
-      <w:r>
-        <w:rPr>
-          <w:rFonts w:ascii="Calibri" w:cs="Calibri" w:eastAsia="Calibri" w:hAnsi="Calibri"/>
-          <w:b w:val="false"/>
-          <w:bCs w:val="false"/>
-          <w:i w:val="false"/>
-          <w:iCs w:val="false"/>
+      </w:pPr>
+      <w:r>
+        <w:rPr>
+          <w:rFonts w:ascii="Calibri" w:cs="Calibri" w:eastAsia="Calibri" w:hAnsi="Calibri"/>
           <w:color w:val="555555"/>
           <w:sz w:val="18"/>
           <w:szCs w:val="18"/>
@@ -1048,7 +898,7 @@
     </w:p>
     <w:p>
       <w:pPr>
-        <w:spacing w:after="0" w:before="200"/>
+        <w:spacing w:after="0" w:before="220"/>
       </w:pPr>
       <w:r>
         <w:rPr>
@@ -1072,16 +922,11 @@
     </w:p>
     <w:p>
       <w:pPr>
-        <w:spacing w:after="60" w:before="60"/>
-        <w:jc w:val="left"/>
-      </w:pPr>
-      <w:r>
-        <w:rPr>
-          <w:rFonts w:ascii="Calibri" w:cs="Calibri" w:eastAsia="Calibri" w:hAnsi="Calibri"/>
-          <w:b w:val="false"/>
-          <w:bCs w:val="false"/>
-          <w:i w:val="false"/>
-          <w:iCs w:val="false"/>
+        <w:spacing w:after="0" w:before="60"/>
+      </w:pPr>
+      <w:r>
+        <w:rPr>
+          <w:rFonts w:ascii="Calibri" w:cs="Calibri" w:eastAsia="Calibri" w:hAnsi="Calibri"/>
           <w:color w:val="1A1A1A"/>
           <w:sz w:val="19"/>
           <w:szCs w:val="19"/>
@@ -1268,11 +1113,11 @@
     <w:lvl w:ilvl="0" w15:tentative="1">
       <w:start w:val="1"/>
       <w:numFmt w:val="bullet"/>
-      <w:lvlText w:val="•"/>
+      <w:lvlText w:val="–"/>
       <w:lvlJc w:val="left"/>
       <w:pPr>
-        <w:spacing w:after="50" w:before="0"/>
-        <w:ind w:left="360" w:hanging="220"/>
+        <w:spacing w:after="55" w:before="0"/>
+        <w:ind w:left="320" w:hanging="200"/>
       </w:pPr>
       <w:rPr>
         <w:rFonts w:ascii="Calibri" w:cs="Calibri" w:eastAsia="Calibri" w:hAnsi="Calibri"/>

</xml_diff>